<commit_message>
Revise Mac handoff manual for neutral handoff
</commit_message>
<xml_diff>
--- a/docs/ios-testflight/handoff/EnglishPlus_iOS_Mac_Teammate_Handoff.docx
+++ b/docs/ios-testflight/handoff/EnglishPlus_iOS_Mac_Teammate_Handoff.docx
@@ -112,7 +112,7 @@
           <w:noProof/>
         </w:rPr>
         <w:drawing>
-          <wp:inline distT="0" distB="0" distL="0" distR="0" wp14:anchorId="36A73A1F" wp14:editId="486D7D9F">
+          <wp:inline distT="0" distB="0" distL="0" distR="0" wp14:anchorId="6AE48964" wp14:editId="5C77A50E">
             <wp:extent cx="6035040" cy="2640330"/>
             <wp:effectExtent l="0" t="0" r="0" b="0"/>
             <wp:docPr id="1" name="Picture 1"/>
@@ -317,660 +317,72 @@
         <w:t xml:space="preserve">1. </w:t>
       </w:r>
       <w:r>
-        <w:t>目前我們的狀態</w:t>
-      </w:r>
-    </w:p>
-    <w:tbl>
-      <w:tblPr>
-        <w:tblStyle w:val="aff2"/>
-        <w:tblW w:w="0" w:type="auto"/>
-        <w:jc w:val="center"/>
-        <w:tblLook w:val="04A0" w:firstRow="1" w:lastRow="0" w:firstColumn="1" w:lastColumn="0" w:noHBand="0" w:noVBand="1"/>
-      </w:tblPr>
-      <w:tblGrid>
-        <w:gridCol w:w="1814"/>
-        <w:gridCol w:w="3458"/>
-        <w:gridCol w:w="3572"/>
-      </w:tblGrid>
-      <w:tr>
-        <w:trPr>
-          <w:jc w:val="center"/>
-        </w:trPr>
-        <w:tc>
-          <w:tcPr>
-            <w:tcW w:w="1814" w:type="dxa"/>
-            <w:shd w:val="clear" w:color="auto" w:fill="173C5A"/>
-            <w:vAlign w:val="center"/>
-          </w:tcPr>
-          <w:p>
-            <w:r>
-              <w:rPr>
-                <w:b/>
-                <w:color w:val="FFFFFF"/>
-                <w:sz w:val="19"/>
-              </w:rPr>
-              <w:t>項目</w:t>
-            </w:r>
-          </w:p>
-        </w:tc>
-        <w:tc>
-          <w:tcPr>
-            <w:tcW w:w="3458" w:type="dxa"/>
-            <w:shd w:val="clear" w:color="auto" w:fill="173C5A"/>
-            <w:vAlign w:val="center"/>
-          </w:tcPr>
-          <w:p>
-            <w:r>
-              <w:rPr>
-                <w:b/>
-                <w:color w:val="FFFFFF"/>
-                <w:sz w:val="19"/>
-              </w:rPr>
-              <w:t>目前狀態</w:t>
-            </w:r>
-          </w:p>
-        </w:tc>
-        <w:tc>
-          <w:tcPr>
-            <w:tcW w:w="3572" w:type="dxa"/>
-            <w:shd w:val="clear" w:color="auto" w:fill="173C5A"/>
-            <w:vAlign w:val="center"/>
-          </w:tcPr>
-          <w:p>
-            <w:r>
-              <w:rPr>
-                <w:b/>
-                <w:color w:val="FFFFFF"/>
-                <w:sz w:val="19"/>
-              </w:rPr>
-              <w:t>對隊友的影響</w:t>
-            </w:r>
-          </w:p>
-        </w:tc>
-      </w:tr>
-      <w:tr>
-        <w:trPr>
-          <w:jc w:val="center"/>
-        </w:trPr>
-        <w:tc>
-          <w:tcPr>
-            <w:tcW w:w="1814" w:type="dxa"/>
-            <w:shd w:val="clear" w:color="auto" w:fill="FAFBFC"/>
-            <w:vAlign w:val="center"/>
-          </w:tcPr>
-          <w:p>
-            <w:r>
-              <w:rPr>
-                <w:sz w:val="19"/>
-              </w:rPr>
-              <w:t>Apple Developer</w:t>
-            </w:r>
-          </w:p>
-        </w:tc>
-        <w:tc>
-          <w:tcPr>
-            <w:tcW w:w="3458" w:type="dxa"/>
-            <w:shd w:val="clear" w:color="auto" w:fill="FAFBFC"/>
-            <w:vAlign w:val="center"/>
-          </w:tcPr>
-          <w:p>
-            <w:r>
-              <w:rPr>
-                <w:sz w:val="19"/>
-              </w:rPr>
-              <w:t>媽媽的帳號已送出申請，狀態是</w:t>
-            </w:r>
-            <w:r>
-              <w:rPr>
-                <w:sz w:val="19"/>
-              </w:rPr>
-              <w:t xml:space="preserve"> Enrollment Pending</w:t>
-            </w:r>
-          </w:p>
-        </w:tc>
-        <w:tc>
-          <w:tcPr>
-            <w:tcW w:w="3572" w:type="dxa"/>
-            <w:shd w:val="clear" w:color="auto" w:fill="FAFBFC"/>
-            <w:vAlign w:val="center"/>
-          </w:tcPr>
-          <w:p>
-            <w:r>
-              <w:rPr>
-                <w:sz w:val="19"/>
-              </w:rPr>
-              <w:t>暫時不能上</w:t>
-            </w:r>
-            <w:r>
-              <w:rPr>
-                <w:sz w:val="19"/>
-              </w:rPr>
-              <w:t xml:space="preserve"> TestFlight</w:t>
-            </w:r>
-            <w:r>
-              <w:rPr>
-                <w:sz w:val="19"/>
-              </w:rPr>
-              <w:t>，但不影響</w:t>
-            </w:r>
-            <w:r>
-              <w:rPr>
-                <w:sz w:val="19"/>
-              </w:rPr>
-              <w:t xml:space="preserve"> Xcode </w:t>
-            </w:r>
-            <w:r>
-              <w:rPr>
-                <w:sz w:val="19"/>
-              </w:rPr>
-              <w:t>本機開發</w:t>
-            </w:r>
-          </w:p>
-        </w:tc>
-      </w:tr>
-      <w:tr>
-        <w:trPr>
-          <w:jc w:val="center"/>
-        </w:trPr>
-        <w:tc>
-          <w:tcPr>
-            <w:tcW w:w="1814" w:type="dxa"/>
-            <w:vAlign w:val="center"/>
-          </w:tcPr>
-          <w:p>
-            <w:r>
-              <w:rPr>
-                <w:sz w:val="19"/>
-              </w:rPr>
-              <w:t xml:space="preserve">Mac </w:t>
-            </w:r>
-            <w:r>
-              <w:rPr>
-                <w:sz w:val="19"/>
-              </w:rPr>
-              <w:t>開發</w:t>
-            </w:r>
-          </w:p>
-        </w:tc>
-        <w:tc>
-          <w:tcPr>
-            <w:tcW w:w="3458" w:type="dxa"/>
-            <w:vAlign w:val="center"/>
-          </w:tcPr>
-          <w:p>
-            <w:r>
-              <w:rPr>
-                <w:sz w:val="19"/>
-              </w:rPr>
-              <w:t>隊友有</w:t>
-            </w:r>
-            <w:r>
-              <w:rPr>
-                <w:sz w:val="19"/>
-              </w:rPr>
-              <w:t xml:space="preserve"> Mac</w:t>
-            </w:r>
-            <w:r>
-              <w:rPr>
-                <w:sz w:val="19"/>
-              </w:rPr>
-              <w:t>，可以先接手</w:t>
-            </w:r>
-            <w:r>
-              <w:rPr>
-                <w:sz w:val="19"/>
-              </w:rPr>
-              <w:t xml:space="preserve"> iOS </w:t>
-            </w:r>
-            <w:r>
-              <w:rPr>
-                <w:sz w:val="19"/>
-              </w:rPr>
-              <w:t>版</w:t>
-            </w:r>
-          </w:p>
-        </w:tc>
-        <w:tc>
-          <w:tcPr>
-            <w:tcW w:w="3572" w:type="dxa"/>
-            <w:vAlign w:val="center"/>
-          </w:tcPr>
-          <w:p>
-            <w:r>
-              <w:rPr>
-                <w:sz w:val="19"/>
-              </w:rPr>
-              <w:t>可立即安裝</w:t>
-            </w:r>
-            <w:r>
-              <w:rPr>
-                <w:sz w:val="19"/>
-              </w:rPr>
-              <w:t xml:space="preserve"> Xcode</w:t>
-            </w:r>
-            <w:r>
-              <w:rPr>
-                <w:sz w:val="19"/>
-              </w:rPr>
-              <w:t>、</w:t>
-            </w:r>
-            <w:r>
-              <w:rPr>
-                <w:sz w:val="19"/>
-              </w:rPr>
-              <w:t>clone GitHub</w:t>
-            </w:r>
-            <w:r>
-              <w:rPr>
-                <w:sz w:val="19"/>
-              </w:rPr>
-              <w:t>、建</w:t>
-            </w:r>
-            <w:r>
-              <w:rPr>
-                <w:sz w:val="19"/>
-              </w:rPr>
-              <w:t xml:space="preserve"> SwiftUI </w:t>
-            </w:r>
-            <w:r>
-              <w:rPr>
-                <w:sz w:val="19"/>
-              </w:rPr>
-              <w:t>專案</w:t>
-            </w:r>
-          </w:p>
-        </w:tc>
-      </w:tr>
-      <w:tr>
-        <w:trPr>
-          <w:jc w:val="center"/>
-        </w:trPr>
-        <w:tc>
-          <w:tcPr>
-            <w:tcW w:w="1814" w:type="dxa"/>
-            <w:shd w:val="clear" w:color="auto" w:fill="FAFBFC"/>
-            <w:vAlign w:val="center"/>
-          </w:tcPr>
-          <w:p>
-            <w:r>
-              <w:rPr>
-                <w:sz w:val="19"/>
-              </w:rPr>
-              <w:t>GitHub</w:t>
-            </w:r>
-          </w:p>
-        </w:tc>
-        <w:tc>
-          <w:tcPr>
-            <w:tcW w:w="3458" w:type="dxa"/>
-            <w:shd w:val="clear" w:color="auto" w:fill="FAFBFC"/>
-            <w:vAlign w:val="center"/>
-          </w:tcPr>
-          <w:p>
-            <w:r>
-              <w:rPr>
-                <w:sz w:val="19"/>
-              </w:rPr>
-              <w:t>使用</w:t>
-            </w:r>
-            <w:r>
-              <w:rPr>
-                <w:sz w:val="19"/>
-              </w:rPr>
-              <w:t xml:space="preserve"> RayChen0503/English-PLUS</w:t>
-            </w:r>
-            <w:r>
-              <w:rPr>
-                <w:sz w:val="19"/>
-              </w:rPr>
-              <w:t>，分支採</w:t>
-            </w:r>
-            <w:r>
-              <w:rPr>
-                <w:sz w:val="19"/>
-              </w:rPr>
-              <w:t xml:space="preserve"> main</w:t>
-            </w:r>
-          </w:p>
-        </w:tc>
-        <w:tc>
-          <w:tcPr>
-            <w:tcW w:w="3572" w:type="dxa"/>
-            <w:shd w:val="clear" w:color="auto" w:fill="FAFBFC"/>
-            <w:vAlign w:val="center"/>
-          </w:tcPr>
-          <w:p>
-            <w:r>
-              <w:rPr>
-                <w:sz w:val="19"/>
-              </w:rPr>
-              <w:t>隊友需被加為</w:t>
-            </w:r>
-            <w:r>
-              <w:rPr>
-                <w:sz w:val="19"/>
-              </w:rPr>
-              <w:t xml:space="preserve"> collaborator</w:t>
-            </w:r>
-            <w:r>
-              <w:rPr>
-                <w:sz w:val="19"/>
-              </w:rPr>
-              <w:t>，直接</w:t>
-            </w:r>
-            <w:r>
-              <w:rPr>
-                <w:sz w:val="19"/>
-              </w:rPr>
-              <w:t xml:space="preserve"> push main</w:t>
-            </w:r>
-          </w:p>
-        </w:tc>
-      </w:tr>
-      <w:tr>
-        <w:trPr>
-          <w:jc w:val="center"/>
-        </w:trPr>
-        <w:tc>
-          <w:tcPr>
-            <w:tcW w:w="1814" w:type="dxa"/>
-            <w:vAlign w:val="center"/>
-          </w:tcPr>
-          <w:p>
-            <w:r>
-              <w:rPr>
-                <w:sz w:val="19"/>
-              </w:rPr>
-              <w:t xml:space="preserve">iOS </w:t>
-            </w:r>
-            <w:r>
-              <w:rPr>
-                <w:sz w:val="19"/>
-              </w:rPr>
-              <w:t>規格</w:t>
-            </w:r>
-          </w:p>
-        </w:tc>
-        <w:tc>
-          <w:tcPr>
-            <w:tcW w:w="3458" w:type="dxa"/>
-            <w:vAlign w:val="center"/>
-          </w:tcPr>
-          <w:p>
-            <w:r>
-              <w:rPr>
-                <w:sz w:val="19"/>
-              </w:rPr>
-              <w:t>第</w:t>
-            </w:r>
-            <w:r>
-              <w:rPr>
-                <w:sz w:val="19"/>
-              </w:rPr>
-              <w:t xml:space="preserve"> 1 </w:t>
-            </w:r>
-            <w:r>
-              <w:rPr>
-                <w:sz w:val="19"/>
-              </w:rPr>
-              <w:t>到</w:t>
-            </w:r>
-            <w:r>
-              <w:rPr>
-                <w:sz w:val="19"/>
-              </w:rPr>
-              <w:t xml:space="preserve"> 8 </w:t>
-            </w:r>
-            <w:r>
-              <w:rPr>
-                <w:sz w:val="19"/>
-              </w:rPr>
-              <w:t>輪文件已整理在</w:t>
-            </w:r>
-            <w:r>
-              <w:rPr>
-                <w:sz w:val="19"/>
-              </w:rPr>
-              <w:t xml:space="preserve"> docs/ios-testflight</w:t>
-            </w:r>
-          </w:p>
-        </w:tc>
-        <w:tc>
-          <w:tcPr>
-            <w:tcW w:w="3572" w:type="dxa"/>
-            <w:vAlign w:val="center"/>
-          </w:tcPr>
-          <w:p>
-            <w:r>
-              <w:rPr>
-                <w:sz w:val="19"/>
-              </w:rPr>
-              <w:t>先看第</w:t>
-            </w:r>
-            <w:r>
-              <w:rPr>
-                <w:sz w:val="19"/>
-              </w:rPr>
-              <w:t xml:space="preserve"> 8 </w:t>
-            </w:r>
-            <w:r>
-              <w:rPr>
-                <w:sz w:val="19"/>
-              </w:rPr>
-              <w:t>輪主文件，再回看第</w:t>
-            </w:r>
-            <w:r>
-              <w:rPr>
-                <w:sz w:val="19"/>
-              </w:rPr>
-              <w:t xml:space="preserve"> 2/3 </w:t>
-            </w:r>
-            <w:r>
-              <w:rPr>
-                <w:sz w:val="19"/>
-              </w:rPr>
-              <w:t>輪</w:t>
-            </w:r>
-          </w:p>
-        </w:tc>
-      </w:tr>
-      <w:tr>
-        <w:trPr>
-          <w:jc w:val="center"/>
-        </w:trPr>
-        <w:tc>
-          <w:tcPr>
-            <w:tcW w:w="1814" w:type="dxa"/>
-            <w:shd w:val="clear" w:color="auto" w:fill="FAFBFC"/>
-            <w:vAlign w:val="center"/>
-          </w:tcPr>
-          <w:p>
-            <w:r>
-              <w:rPr>
-                <w:sz w:val="19"/>
-              </w:rPr>
-              <w:lastRenderedPageBreak/>
-              <w:t>Firebase / AI</w:t>
-            </w:r>
-          </w:p>
-        </w:tc>
-        <w:tc>
-          <w:tcPr>
-            <w:tcW w:w="3458" w:type="dxa"/>
-            <w:shd w:val="clear" w:color="auto" w:fill="FAFBFC"/>
-            <w:vAlign w:val="center"/>
-          </w:tcPr>
-          <w:p>
-            <w:r>
-              <w:rPr>
-                <w:sz w:val="19"/>
-              </w:rPr>
-              <w:t>已有規格與草稿，尚未正式部署</w:t>
-            </w:r>
-          </w:p>
-        </w:tc>
-        <w:tc>
-          <w:tcPr>
-            <w:tcW w:w="3572" w:type="dxa"/>
-            <w:shd w:val="clear" w:color="auto" w:fill="FAFBFC"/>
-            <w:vAlign w:val="center"/>
-          </w:tcPr>
-          <w:p>
-            <w:r>
-              <w:rPr>
-                <w:sz w:val="19"/>
-              </w:rPr>
-              <w:t>第一版可先</w:t>
-            </w:r>
-            <w:r>
-              <w:rPr>
-                <w:sz w:val="19"/>
-              </w:rPr>
-              <w:t xml:space="preserve"> mock/local data</w:t>
-            </w:r>
-            <w:r>
-              <w:rPr>
-                <w:sz w:val="19"/>
-              </w:rPr>
-              <w:t>，不要等</w:t>
-            </w:r>
-            <w:r>
-              <w:rPr>
-                <w:sz w:val="19"/>
-              </w:rPr>
-              <w:t xml:space="preserve"> Firebase </w:t>
-            </w:r>
-            <w:r>
-              <w:rPr>
-                <w:sz w:val="19"/>
-              </w:rPr>
-              <w:t>才開工</w:t>
-            </w:r>
-          </w:p>
-        </w:tc>
-      </w:tr>
-    </w:tbl>
-    <w:p/>
-    <w:p>
-      <w:pPr>
-        <w:pStyle w:val="1"/>
-      </w:pPr>
-      <w:r>
-        <w:t xml:space="preserve">2. </w:t>
-      </w:r>
-      <w:r>
-        <w:t>誰負責什麼</w:t>
+        <w:t>隊友現在立刻可以做的事</w:t>
       </w:r>
     </w:p>
     <w:p>
       <w:pPr>
-        <w:jc w:val="center"/>
+        <w:pStyle w:val="a"/>
       </w:pPr>
       <w:r>
-        <w:rPr>
-          <w:noProof/>
-        </w:rPr>
-        <w:drawing>
-          <wp:inline distT="0" distB="0" distL="0" distR="0" wp14:anchorId="2B7905BE" wp14:editId="5CDE20B7">
-            <wp:extent cx="6035040" cy="2942082"/>
-            <wp:effectExtent l="0" t="0" r="0" b="0"/>
-            <wp:docPr id="2" name="Picture 2"/>
-            <wp:cNvGraphicFramePr>
-              <a:graphicFrameLocks xmlns:a="http://schemas.openxmlformats.org/drawingml/2006/main" noChangeAspect="1"/>
-            </wp:cNvGraphicFramePr>
-            <a:graphic xmlns:a="http://schemas.openxmlformats.org/drawingml/2006/main">
-              <a:graphicData uri="http://schemas.openxmlformats.org/drawingml/2006/picture">
-                <pic:pic xmlns:pic="http://schemas.openxmlformats.org/drawingml/2006/picture">
-                  <pic:nvPicPr>
-                    <pic:cNvPr id="0" name="handoff_roles.png"/>
-                    <pic:cNvPicPr/>
-                  </pic:nvPicPr>
-                  <pic:blipFill>
-                    <a:blip r:embed="rId9"/>
-                    <a:stretch>
-                      <a:fillRect/>
-                    </a:stretch>
-                  </pic:blipFill>
-                  <pic:spPr>
-                    <a:xfrm>
-                      <a:off x="0" y="0"/>
-                      <a:ext cx="6035040" cy="2942082"/>
-                    </a:xfrm>
-                    <a:prstGeom prst="rect">
-                      <a:avLst/>
-                    </a:prstGeom>
-                  </pic:spPr>
-                </pic:pic>
-              </a:graphicData>
-            </a:graphic>
-          </wp:inline>
-        </w:drawing>
+        <w:t>安裝</w:t>
+      </w:r>
+      <w:r>
+        <w:t xml:space="preserve"> Xcode</w:t>
+      </w:r>
+      <w:r>
+        <w:t>，第一次打開時讓它把必要元件裝完。</w:t>
       </w:r>
     </w:p>
     <w:p>
       <w:pPr>
-        <w:pStyle w:val="a0"/>
+        <w:pStyle w:val="a"/>
       </w:pPr>
       <w:r>
-        <w:t>你：保留產品方向、</w:t>
-      </w:r>
-      <w:r>
-        <w:t>GitHub repo</w:t>
-      </w:r>
-      <w:r>
-        <w:t>、需求決策與課程脈絡。</w:t>
+        <w:t>安裝</w:t>
+      </w:r>
+      <w:r>
+        <w:t xml:space="preserve"> GitHub Desktop</w:t>
+      </w:r>
+      <w:r>
+        <w:t>，登入自己的</w:t>
+      </w:r>
+      <w:r>
+        <w:t xml:space="preserve"> GitHub </w:t>
+      </w:r>
+      <w:r>
+        <w:t>帳號。</w:t>
       </w:r>
     </w:p>
     <w:p>
       <w:pPr>
-        <w:pStyle w:val="a0"/>
+        <w:pStyle w:val="a"/>
       </w:pPr>
       <w:r>
-        <w:t>媽媽：</w:t>
-      </w:r>
-      <w:r>
-        <w:t>Apple Developer Account Holder</w:t>
-      </w:r>
-      <w:r>
-        <w:t>，負責付款、審核、合約、邀請隊友與必要</w:t>
-      </w:r>
-      <w:r>
-        <w:t xml:space="preserve"> signing </w:t>
-      </w:r>
-      <w:r>
-        <w:t>協助。</w:t>
+        <w:t>確認自己已被加入</w:t>
+      </w:r>
+      <w:r>
+        <w:t xml:space="preserve"> English-PLUS repository collaborator</w:t>
+      </w:r>
+      <w:r>
+        <w:t>。</w:t>
       </w:r>
     </w:p>
     <w:p>
       <w:pPr>
-        <w:pStyle w:val="a0"/>
+        <w:pStyle w:val="a"/>
       </w:pPr>
       <w:r>
-        <w:t xml:space="preserve">Mac </w:t>
-      </w:r>
-      <w:r>
-        <w:t>隊友：用</w:t>
-      </w:r>
-      <w:r>
-        <w:t xml:space="preserve"> Xcode </w:t>
-      </w:r>
-      <w:r>
-        <w:t>實作</w:t>
-      </w:r>
-      <w:r>
-        <w:t xml:space="preserve"> iOS </w:t>
-      </w:r>
-      <w:r>
-        <w:t>版，透過</w:t>
-      </w:r>
-      <w:r>
-        <w:t xml:space="preserve"> GitHub Desktop push </w:t>
-      </w:r>
-      <w:r>
-        <w:t>回</w:t>
-      </w:r>
-      <w:r>
-        <w:t xml:space="preserve"> main</w:t>
+        <w:t>用</w:t>
+      </w:r>
+      <w:r>
+        <w:t xml:space="preserve"> GitHub Desktop clone </w:t>
+      </w:r>
+      <w:r>
+        <w:t>專案到</w:t>
+      </w:r>
+      <w:r>
+        <w:t xml:space="preserve"> Mac</w:t>
       </w:r>
       <w:r>
         <w:t>。</w:t>
@@ -978,22 +390,73 @@
     </w:p>
     <w:p>
       <w:pPr>
-        <w:pStyle w:val="a0"/>
+        <w:pStyle w:val="a"/>
       </w:pPr>
       <w:r>
-        <w:t>Firebase/OpenRouter</w:t>
-      </w:r>
-      <w:r>
-        <w:t>：等本機流程穩定後再接；</w:t>
-      </w:r>
-      <w:r>
-        <w:t xml:space="preserve">OpenRouter key </w:t>
-      </w:r>
-      <w:r>
-        <w:t>不放進</w:t>
-      </w:r>
-      <w:r>
-        <w:t xml:space="preserve"> App</w:t>
+        <w:t>先閱讀</w:t>
+      </w:r>
+      <w:r>
+        <w:t xml:space="preserve"> docs/ios-testflight/round-8-xcode-development-handoff.md</w:t>
+      </w:r>
+      <w:r>
+        <w:t>。</w:t>
+      </w:r>
+    </w:p>
+    <w:p>
+      <w:pPr>
+        <w:pStyle w:val="a"/>
+      </w:pPr>
+      <w:r>
+        <w:t>在</w:t>
+      </w:r>
+      <w:r>
+        <w:t xml:space="preserve"> repo </w:t>
+      </w:r>
+      <w:r>
+        <w:t>的</w:t>
+      </w:r>
+      <w:r>
+        <w:t xml:space="preserve"> ios/EnglishPlus </w:t>
+      </w:r>
+      <w:r>
+        <w:t>位置建立</w:t>
+      </w:r>
+      <w:r>
+        <w:t xml:space="preserve"> Xcode SwiftUI </w:t>
+      </w:r>
+      <w:r>
+        <w:t>專案。</w:t>
+      </w:r>
+    </w:p>
+    <w:p>
+      <w:pPr>
+        <w:pStyle w:val="a"/>
+      </w:pPr>
+      <w:r>
+        <w:t>先用</w:t>
+      </w:r>
+      <w:r>
+        <w:t xml:space="preserve"> mock/local data </w:t>
+      </w:r>
+      <w:r>
+        <w:t>跑出角色選擇、學生端、老師端、志工端主流程。</w:t>
+      </w:r>
+    </w:p>
+    <w:p>
+      <w:pPr>
+        <w:pStyle w:val="a"/>
+      </w:pPr>
+      <w:r>
+        <w:t>每天完成一小段可以跑的成果後，用</w:t>
+      </w:r>
+      <w:r>
+        <w:t xml:space="preserve"> GitHub Desktop commit </w:t>
+      </w:r>
+      <w:r>
+        <w:t>並</w:t>
+      </w:r>
+      <w:r>
+        <w:t xml:space="preserve"> push main</w:t>
       </w:r>
       <w:r>
         <w:t>。</w:t>
@@ -1004,10 +467,28 @@
         <w:pStyle w:val="1"/>
       </w:pPr>
       <w:r>
-        <w:t xml:space="preserve">3. </w:t>
-      </w:r>
-      <w:r>
-        <w:t>隊友現在立刻可以做的事</w:t>
+        <w:lastRenderedPageBreak/>
+        <w:t xml:space="preserve">2. Mac </w:t>
+      </w:r>
+      <w:r>
+        <w:t>安裝與</w:t>
+      </w:r>
+      <w:r>
+        <w:t xml:space="preserve"> GitHub Desktop clone</w:t>
+      </w:r>
+    </w:p>
+    <w:p>
+      <w:pPr>
+        <w:pStyle w:val="21"/>
+      </w:pPr>
+      <w:r>
+        <w:t xml:space="preserve">2.1 </w:t>
+      </w:r>
+      <w:r>
+        <w:t>安裝</w:t>
+      </w:r>
+      <w:r>
+        <w:t xml:space="preserve"> Xcode</w:t>
       </w:r>
     </w:p>
     <w:p>
@@ -1015,13 +496,13 @@
         <w:pStyle w:val="a"/>
       </w:pPr>
       <w:r>
-        <w:t>安裝</w:t>
-      </w:r>
-      <w:r>
-        <w:t xml:space="preserve"> Xcode</w:t>
-      </w:r>
-      <w:r>
-        <w:t>，第一次打開時讓它把必要元件裝完。</w:t>
+        <w:t>打開</w:t>
+      </w:r>
+      <w:r>
+        <w:t xml:space="preserve"> Mac App Store</w:t>
+      </w:r>
+      <w:r>
+        <w:t>。</w:t>
       </w:r>
     </w:p>
     <w:p>
@@ -1029,19 +510,13 @@
         <w:pStyle w:val="a"/>
       </w:pPr>
       <w:r>
-        <w:t>安裝</w:t>
-      </w:r>
-      <w:r>
-        <w:t xml:space="preserve"> GitHub Desktop</w:t>
-      </w:r>
-      <w:r>
-        <w:t>，登入自己的</w:t>
-      </w:r>
-      <w:r>
-        <w:t xml:space="preserve"> GitHub </w:t>
-      </w:r>
-      <w:r>
-        <w:t>帳號。</w:t>
+        <w:t>搜尋</w:t>
+      </w:r>
+      <w:r>
+        <w:t xml:space="preserve"> Xcode</w:t>
+      </w:r>
+      <w:r>
+        <w:t>。</w:t>
       </w:r>
     </w:p>
     <w:p>
@@ -1049,10 +524,10 @@
         <w:pStyle w:val="a"/>
       </w:pPr>
       <w:r>
-        <w:t>確認自己已被加入</w:t>
-      </w:r>
-      <w:r>
-        <w:t xml:space="preserve"> English-PLUS repository collaborator</w:t>
+        <w:t>安裝完成後打開</w:t>
+      </w:r>
+      <w:r>
+        <w:t xml:space="preserve"> Xcode</w:t>
       </w:r>
       <w:r>
         <w:t>。</w:t>
@@ -1063,19 +538,19 @@
         <w:pStyle w:val="a"/>
       </w:pPr>
       <w:r>
-        <w:t>用</w:t>
-      </w:r>
-      <w:r>
-        <w:t xml:space="preserve"> GitHub Desktop clone </w:t>
-      </w:r>
-      <w:r>
-        <w:t>專案到</w:t>
-      </w:r>
-      <w:r>
-        <w:t xml:space="preserve"> Mac</w:t>
-      </w:r>
-      <w:r>
-        <w:t>。</w:t>
+        <w:t>若</w:t>
+      </w:r>
+      <w:r>
+        <w:t xml:space="preserve"> Xcode </w:t>
+      </w:r>
+      <w:r>
+        <w:t>要安裝</w:t>
+      </w:r>
+      <w:r>
+        <w:t xml:space="preserve"> additional components</w:t>
+      </w:r>
+      <w:r>
+        <w:t>，按同意並等待完成。</w:t>
       </w:r>
     </w:p>
     <w:p>
@@ -1083,13 +558,33 @@
         <w:pStyle w:val="a"/>
       </w:pPr>
       <w:r>
-        <w:t>先閱讀</w:t>
-      </w:r>
-      <w:r>
-        <w:t xml:space="preserve"> docs/ios-testflight/round-8-xcode-development-handoff.md</w:t>
-      </w:r>
-      <w:r>
-        <w:t>。</w:t>
+        <w:t>先不用登入</w:t>
+      </w:r>
+      <w:r>
+        <w:t xml:space="preserve"> Apple Developer team</w:t>
+      </w:r>
+      <w:r>
+        <w:t>，也可以用</w:t>
+      </w:r>
+      <w:r>
+        <w:t xml:space="preserve"> Simulator </w:t>
+      </w:r>
+      <w:r>
+        <w:t>做本機開發。</w:t>
+      </w:r>
+    </w:p>
+    <w:p>
+      <w:pPr>
+        <w:pStyle w:val="21"/>
+      </w:pPr>
+      <w:r>
+        <w:t xml:space="preserve">2.2 </w:t>
+      </w:r>
+      <w:r>
+        <w:t>安裝</w:t>
+      </w:r>
+      <w:r>
+        <w:t xml:space="preserve"> GitHub Desktop</w:t>
       </w:r>
     </w:p>
     <w:p>
@@ -1097,25 +592,19 @@
         <w:pStyle w:val="a"/>
       </w:pPr>
       <w:r>
-        <w:t>在</w:t>
-      </w:r>
-      <w:r>
-        <w:t xml:space="preserve"> repo </w:t>
-      </w:r>
-      <w:r>
-        <w:t>的</w:t>
-      </w:r>
-      <w:r>
-        <w:t xml:space="preserve"> ios/EnglishPlus </w:t>
-      </w:r>
-      <w:r>
-        <w:t>位置建立</w:t>
-      </w:r>
-      <w:r>
-        <w:t xml:space="preserve"> Xcode SwiftUI </w:t>
-      </w:r>
-      <w:r>
-        <w:t>專案。</w:t>
+        <w:t>到</w:t>
+      </w:r>
+      <w:r>
+        <w:t xml:space="preserve"> https://desktop.github.com/ </w:t>
+      </w:r>
+      <w:r>
+        <w:t>下載</w:t>
+      </w:r>
+      <w:r>
+        <w:t xml:space="preserve"> GitHub Desktop</w:t>
+      </w:r>
+      <w:r>
+        <w:t>。</w:t>
       </w:r>
     </w:p>
     <w:p>
@@ -1123,13 +612,13 @@
         <w:pStyle w:val="a"/>
       </w:pPr>
       <w:r>
-        <w:t>先用</w:t>
-      </w:r>
-      <w:r>
-        <w:t xml:space="preserve"> mock/local data </w:t>
-      </w:r>
-      <w:r>
-        <w:t>跑出角色選擇、學生端、老師端、志工端主流程。</w:t>
+        <w:t>安裝並登入隊友自己的</w:t>
+      </w:r>
+      <w:r>
+        <w:t xml:space="preserve"> GitHub </w:t>
+      </w:r>
+      <w:r>
+        <w:t>帳號。</w:t>
       </w:r>
     </w:p>
     <w:p>
@@ -1137,34 +626,25 @@
         <w:pStyle w:val="a"/>
       </w:pPr>
       <w:r>
-        <w:t>每天完成一小段可以跑的成果後，用</w:t>
-      </w:r>
-      <w:r>
-        <w:t xml:space="preserve"> GitHub Desktop commit </w:t>
-      </w:r>
-      <w:r>
-        <w:t>並</w:t>
-      </w:r>
-      <w:r>
-        <w:t xml:space="preserve"> push main</w:t>
-      </w:r>
-      <w:r>
-        <w:t>。</w:t>
-      </w:r>
-    </w:p>
-    <w:p>
-      <w:pPr>
-        <w:pStyle w:val="1"/>
-      </w:pPr>
-      <w:r>
-        <w:lastRenderedPageBreak/>
-        <w:t xml:space="preserve">4. Mac </w:t>
-      </w:r>
-      <w:r>
-        <w:t>安裝與</w:t>
-      </w:r>
-      <w:r>
-        <w:t xml:space="preserve"> GitHub Desktop clone</w:t>
+        <w:t>如果</w:t>
+      </w:r>
+      <w:r>
+        <w:t xml:space="preserve"> clone </w:t>
+      </w:r>
+      <w:r>
+        <w:t>時跳出</w:t>
+      </w:r>
+      <w:r>
+        <w:t xml:space="preserve"> fork </w:t>
+      </w:r>
+      <w:r>
+        <w:t>提示，代表還沒有</w:t>
+      </w:r>
+      <w:r>
+        <w:t xml:space="preserve"> collaborator </w:t>
+      </w:r>
+      <w:r>
+        <w:t>權限，先不要繼續，請你加她權限。</w:t>
       </w:r>
     </w:p>
     <w:p>
@@ -1172,177 +652,7 @@
         <w:pStyle w:val="21"/>
       </w:pPr>
       <w:r>
-        <w:t xml:space="preserve">4.1 </w:t>
-      </w:r>
-      <w:r>
-        <w:t>安裝</w:t>
-      </w:r>
-      <w:r>
-        <w:t xml:space="preserve"> Xcode</w:t>
-      </w:r>
-    </w:p>
-    <w:p>
-      <w:pPr>
-        <w:pStyle w:val="a"/>
-      </w:pPr>
-      <w:r>
-        <w:t>打開</w:t>
-      </w:r>
-      <w:r>
-        <w:t xml:space="preserve"> Mac App Store</w:t>
-      </w:r>
-      <w:r>
-        <w:t>。</w:t>
-      </w:r>
-    </w:p>
-    <w:p>
-      <w:pPr>
-        <w:pStyle w:val="a"/>
-      </w:pPr>
-      <w:r>
-        <w:t>搜尋</w:t>
-      </w:r>
-      <w:r>
-        <w:t xml:space="preserve"> Xcode</w:t>
-      </w:r>
-      <w:r>
-        <w:t>。</w:t>
-      </w:r>
-    </w:p>
-    <w:p>
-      <w:pPr>
-        <w:pStyle w:val="a"/>
-      </w:pPr>
-      <w:r>
-        <w:t>安裝完成後打開</w:t>
-      </w:r>
-      <w:r>
-        <w:t xml:space="preserve"> Xcode</w:t>
-      </w:r>
-      <w:r>
-        <w:t>。</w:t>
-      </w:r>
-    </w:p>
-    <w:p>
-      <w:pPr>
-        <w:pStyle w:val="a"/>
-      </w:pPr>
-      <w:r>
-        <w:t>若</w:t>
-      </w:r>
-      <w:r>
-        <w:t xml:space="preserve"> Xcode </w:t>
-      </w:r>
-      <w:r>
-        <w:t>要安裝</w:t>
-      </w:r>
-      <w:r>
-        <w:t xml:space="preserve"> additional components</w:t>
-      </w:r>
-      <w:r>
-        <w:t>，按同意並等待完成。</w:t>
-      </w:r>
-    </w:p>
-    <w:p>
-      <w:pPr>
-        <w:pStyle w:val="a"/>
-      </w:pPr>
-      <w:r>
-        <w:t>先不用登入</w:t>
-      </w:r>
-      <w:r>
-        <w:t xml:space="preserve"> Apple Developer team</w:t>
-      </w:r>
-      <w:r>
-        <w:t>，也可以用</w:t>
-      </w:r>
-      <w:r>
-        <w:t xml:space="preserve"> Simulator </w:t>
-      </w:r>
-      <w:r>
-        <w:t>做本機開發。</w:t>
-      </w:r>
-    </w:p>
-    <w:p>
-      <w:pPr>
-        <w:pStyle w:val="21"/>
-      </w:pPr>
-      <w:r>
-        <w:t xml:space="preserve">4.2 </w:t>
-      </w:r>
-      <w:r>
-        <w:t>安裝</w:t>
-      </w:r>
-      <w:r>
-        <w:t xml:space="preserve"> GitHub Desktop</w:t>
-      </w:r>
-    </w:p>
-    <w:p>
-      <w:pPr>
-        <w:pStyle w:val="a"/>
-      </w:pPr>
-      <w:r>
-        <w:t>到</w:t>
-      </w:r>
-      <w:r>
-        <w:t xml:space="preserve"> https://desktop.github.com/ </w:t>
-      </w:r>
-      <w:r>
-        <w:t>下載</w:t>
-      </w:r>
-      <w:r>
-        <w:t xml:space="preserve"> GitHub Desktop</w:t>
-      </w:r>
-      <w:r>
-        <w:t>。</w:t>
-      </w:r>
-    </w:p>
-    <w:p>
-      <w:pPr>
-        <w:pStyle w:val="a"/>
-      </w:pPr>
-      <w:r>
-        <w:t>安裝並登入隊友自己的</w:t>
-      </w:r>
-      <w:r>
-        <w:t xml:space="preserve"> GitHub </w:t>
-      </w:r>
-      <w:r>
-        <w:t>帳號。</w:t>
-      </w:r>
-    </w:p>
-    <w:p>
-      <w:pPr>
-        <w:pStyle w:val="a"/>
-      </w:pPr>
-      <w:r>
-        <w:t>如果</w:t>
-      </w:r>
-      <w:r>
-        <w:t xml:space="preserve"> clone </w:t>
-      </w:r>
-      <w:r>
-        <w:t>時跳出</w:t>
-      </w:r>
-      <w:r>
-        <w:t xml:space="preserve"> fork </w:t>
-      </w:r>
-      <w:r>
-        <w:t>提示，代表還沒有</w:t>
-      </w:r>
-      <w:r>
-        <w:t xml:space="preserve"> collaborator </w:t>
-      </w:r>
-      <w:r>
-        <w:t>權限，先不要繼續，請你加她權限。</w:t>
-      </w:r>
-    </w:p>
-    <w:p>
-      <w:pPr>
-        <w:pStyle w:val="21"/>
-      </w:pPr>
-      <w:r>
-        <w:t xml:space="preserve">4.3 Clone </w:t>
+        <w:t xml:space="preserve">2.3 Clone </w:t>
       </w:r>
       <w:r>
         <w:t>專案</w:t>
@@ -1451,7 +761,7 @@
         <w:pStyle w:val="1"/>
       </w:pPr>
       <w:r>
-        <w:t xml:space="preserve">5. </w:t>
+        <w:t xml:space="preserve">3. </w:t>
       </w:r>
       <w:r>
         <w:t>隊友必讀文件順序</w:t>
@@ -1860,7 +1170,7 @@
         <w:pStyle w:val="21"/>
       </w:pPr>
       <w:r>
-        <w:t xml:space="preserve">5.1 </w:t>
+        <w:t xml:space="preserve">3.1 </w:t>
       </w:r>
       <w:r>
         <w:t>怎麼看懂交接文件</w:t>
@@ -2495,7 +1805,7 @@
         <w:pStyle w:val="21"/>
       </w:pPr>
       <w:r>
-        <w:t xml:space="preserve">5.2 </w:t>
+        <w:t xml:space="preserve">3.2 </w:t>
       </w:r>
       <w:r>
         <w:t>如果文件看不懂，先問這三個問題</w:t>
@@ -2561,7 +1871,7 @@
       </w:pPr>
       <w:r>
         <w:lastRenderedPageBreak/>
-        <w:t xml:space="preserve">6. Xcode </w:t>
+        <w:t xml:space="preserve">4. Xcode </w:t>
       </w:r>
       <w:r>
         <w:t>專案建立設定</w:t>
@@ -2943,7 +2253,19 @@
               <w:rPr>
                 <w:sz w:val="19"/>
               </w:rPr>
-              <w:t>通過前可先留空；通過後選媽媽的</w:t>
+              <w:t>通過前可先留空；通過後選</w:t>
+            </w:r>
+            <w:r>
+              <w:rPr>
+                <w:sz w:val="19"/>
+              </w:rPr>
+              <w:t xml:space="preserve"> Account Holder </w:t>
+            </w:r>
+            <w:r>
+              <w:rPr>
+                <w:sz w:val="19"/>
+              </w:rPr>
+              <w:t>的</w:t>
             </w:r>
             <w:r>
               <w:rPr>
@@ -3092,7 +2414,7 @@
         <w:pStyle w:val="21"/>
       </w:pPr>
       <w:r>
-        <w:t xml:space="preserve">6.1 Xcode </w:t>
+        <w:t xml:space="preserve">4.1 Xcode </w:t>
       </w:r>
       <w:r>
         <w:t>實際操作步驟</w:t>
@@ -3195,10 +2517,10 @@
         <w:t xml:space="preserve">Apple Developer </w:t>
       </w:r>
       <w:r>
-        <w:t>通過且隊友被邀請後再回來選媽媽的</w:t>
-      </w:r>
-      <w:r>
-        <w:t xml:space="preserve"> Team</w:t>
+        <w:t>通過且隊友被邀請後再回來選</w:t>
+      </w:r>
+      <w:r>
+        <w:t xml:space="preserve"> Developer Team</w:t>
       </w:r>
       <w:r>
         <w:t>。</w:t>
@@ -3332,7 +2654,7 @@
         <w:pStyle w:val="21"/>
       </w:pPr>
       <w:r>
-        <w:t xml:space="preserve">6.2 Xcode </w:t>
+        <w:t xml:space="preserve">4.2 Xcode </w:t>
       </w:r>
       <w:r>
         <w:t>左側檔案怎麼看</w:t>
@@ -3455,7 +2777,7 @@
         <w:pStyle w:val="21"/>
       </w:pPr>
       <w:r>
-        <w:t xml:space="preserve">6.3 </w:t>
+        <w:t xml:space="preserve">4.3 </w:t>
       </w:r>
       <w:r>
         <w:t>怎麼在</w:t>
@@ -3595,7 +2917,7 @@
         <w:pStyle w:val="21"/>
       </w:pPr>
       <w:r>
-        <w:t xml:space="preserve">6.4 </w:t>
+        <w:t xml:space="preserve">4.4 </w:t>
       </w:r>
       <w:r>
         <w:t>常見</w:t>
@@ -4107,7 +3429,7 @@
       </w:pPr>
       <w:r>
         <w:lastRenderedPageBreak/>
-        <w:t xml:space="preserve">7. iOS </w:t>
+        <w:t xml:space="preserve">5. iOS </w:t>
       </w:r>
       <w:r>
         <w:t>第一版流程</w:t>
@@ -4122,10 +3444,10 @@
           <w:noProof/>
         </w:rPr>
         <w:drawing>
-          <wp:inline distT="0" distB="0" distL="0" distR="0" wp14:anchorId="5099EC63" wp14:editId="3C0E7EFC">
+          <wp:inline distT="0" distB="0" distL="0" distR="0" wp14:anchorId="7504014B" wp14:editId="35B29A13">
             <wp:extent cx="6035040" cy="2866644"/>
             <wp:effectExtent l="0" t="0" r="0" b="0"/>
-            <wp:docPr id="3" name="Picture 3"/>
+            <wp:docPr id="2" name="Picture 2"/>
             <wp:cNvGraphicFramePr>
               <a:graphicFrameLocks xmlns:a="http://schemas.openxmlformats.org/drawingml/2006/main" noChangeAspect="1"/>
             </wp:cNvGraphicFramePr>
@@ -4137,7 +3459,7 @@
                     <pic:cNvPicPr/>
                   </pic:nvPicPr>
                   <pic:blipFill>
-                    <a:blip r:embed="rId10"/>
+                    <a:blip r:embed="rId9"/>
                     <a:stretch>
                       <a:fillRect/>
                     </a:stretch>
@@ -4270,7 +3592,7 @@
         <w:pStyle w:val="1"/>
       </w:pPr>
       <w:r>
-        <w:t xml:space="preserve">8. </w:t>
+        <w:t xml:space="preserve">6. </w:t>
       </w:r>
       <w:r>
         <w:t>建議的</w:t>
@@ -4320,13 +3642,6 @@
           <w:sz w:val="18"/>
         </w:rPr>
         <w:br/>
-      </w:r>
-      <w:r>
-        <w:rPr>
-          <w:rFonts w:ascii="Consolas" w:hAnsi="Consolas"/>
-          <w:color w:val="1F2937"/>
-          <w:sz w:val="18"/>
-        </w:rPr>
         <w:t xml:space="preserve">    AppState.swift</w:t>
       </w:r>
       <w:r>
@@ -4533,7 +3848,15 @@
           <w:sz w:val="18"/>
         </w:rPr>
         <w:br/>
-        <w:t xml:space="preserve">      DemoLoginView.swift</w:t>
+        <w:t xml:space="preserve">      DemoLoginView.swif</w:t>
+      </w:r>
+      <w:r>
+        <w:rPr>
+          <w:rFonts w:ascii="Consolas" w:hAnsi="Consolas"/>
+          <w:color w:val="1F2937"/>
+          <w:sz w:val="18"/>
+        </w:rPr>
+        <w:t>t</w:t>
       </w:r>
       <w:r>
         <w:rPr>
@@ -4551,15 +3874,7 @@
           <w:sz w:val="18"/>
         </w:rPr>
         <w:br/>
-        <w:t xml:space="preserve">   </w:t>
-      </w:r>
-      <w:r>
-        <w:rPr>
-          <w:rFonts w:ascii="Consolas" w:hAnsi="Consolas"/>
-          <w:color w:val="1F2937"/>
-          <w:sz w:val="18"/>
-        </w:rPr>
-        <w:t xml:space="preserve"> Student/</w:t>
+        <w:t xml:space="preserve">    Student/</w:t>
       </w:r>
       <w:r>
         <w:rPr>
@@ -4710,7 +4025,7 @@
         <w:pStyle w:val="1"/>
       </w:pPr>
       <w:r>
-        <w:t xml:space="preserve">9. Firebase </w:t>
+        <w:t xml:space="preserve">7. Firebase </w:t>
       </w:r>
       <w:r>
         <w:t>什麼時候接</w:t>
@@ -5204,7 +4519,7 @@
       </w:pPr>
       <w:r>
         <w:lastRenderedPageBreak/>
-        <w:t xml:space="preserve">10. GitHub Desktop </w:t>
+        <w:t xml:space="preserve">8. GitHub Desktop </w:t>
       </w:r>
       <w:r>
         <w:t>每天怎麼做</w:t>
@@ -5461,7 +4776,7 @@
         <w:pStyle w:val="1"/>
       </w:pPr>
       <w:r>
-        <w:t xml:space="preserve">11. Apple Developer </w:t>
+        <w:t xml:space="preserve">9. Apple Developer </w:t>
       </w:r>
       <w:r>
         <w:t>通過後要做什麼</w:t>
@@ -5472,7 +4787,10 @@
         <w:pStyle w:val="a"/>
       </w:pPr>
       <w:r>
-        <w:t>媽媽帳號確認</w:t>
+        <w:t xml:space="preserve">Account Holder </w:t>
+      </w:r>
+      <w:r>
+        <w:t>確認</w:t>
       </w:r>
       <w:r>
         <w:t xml:space="preserve"> Apple Developer membership active</w:t>
@@ -5486,7 +4804,10 @@
         <w:pStyle w:val="a"/>
       </w:pPr>
       <w:r>
-        <w:t>媽媽登入</w:t>
+        <w:t xml:space="preserve">Account Holder </w:t>
+      </w:r>
+      <w:r>
+        <w:t>登入</w:t>
       </w:r>
       <w:r>
         <w:t xml:space="preserve"> App Store Connect</w:t>
@@ -5540,7 +4861,7 @@
         <w:t xml:space="preserve"> Team </w:t>
       </w:r>
       <w:r>
-        <w:t>選媽媽的</w:t>
+        <w:t>選該</w:t>
       </w:r>
       <w:r>
         <w:t xml:space="preserve"> Developer Team</w:t>
@@ -5560,7 +4881,7 @@
         <w:t xml:space="preserve"> signing </w:t>
       </w:r>
       <w:r>
-        <w:t>卡住，由媽媽</w:t>
+        <w:t>卡住，由</w:t>
       </w:r>
       <w:r>
         <w:t xml:space="preserve"> Account Holder </w:t>
@@ -5630,135 +4951,7 @@
         <w:pStyle w:val="1"/>
       </w:pPr>
       <w:r>
-        <w:t xml:space="preserve">12. </w:t>
-      </w:r>
-      <w:r>
-        <w:t>現在不要做的事</w:t>
-      </w:r>
-    </w:p>
-    <w:p>
-      <w:pPr>
-        <w:pStyle w:val="a0"/>
-      </w:pPr>
-      <w:r>
-        <w:t>不要共用媽媽</w:t>
-      </w:r>
-      <w:r>
-        <w:t xml:space="preserve"> Apple ID </w:t>
-      </w:r>
-      <w:r>
-        <w:t>密碼給隊友。</w:t>
-      </w:r>
-    </w:p>
-    <w:p>
-      <w:pPr>
-        <w:pStyle w:val="a0"/>
-      </w:pPr>
-      <w:r>
-        <w:t>不要直接把</w:t>
-      </w:r>
-      <w:r>
-        <w:t xml:space="preserve"> OpenRouter API key </w:t>
-      </w:r>
-      <w:r>
-        <w:t>寫進</w:t>
-      </w:r>
-      <w:r>
-        <w:t xml:space="preserve"> Swift code</w:t>
-      </w:r>
-      <w:r>
-        <w:t>。</w:t>
-      </w:r>
-    </w:p>
-    <w:p>
-      <w:pPr>
-        <w:pStyle w:val="a0"/>
-      </w:pPr>
-      <w:r>
-        <w:t>不要還沒跑通本機流程就硬接所有</w:t>
-      </w:r>
-      <w:r>
-        <w:t xml:space="preserve"> Firebase/AI</w:t>
-      </w:r>
-      <w:r>
-        <w:t>。</w:t>
-      </w:r>
-    </w:p>
-    <w:p>
-      <w:pPr>
-        <w:pStyle w:val="a0"/>
-      </w:pPr>
-      <w:r>
-        <w:t>不要使用錯誤</w:t>
-      </w:r>
-      <w:r>
-        <w:t xml:space="preserve"> bundle ID</w:t>
-      </w:r>
-      <w:r>
-        <w:t>。</w:t>
-      </w:r>
-    </w:p>
-    <w:p>
-      <w:pPr>
-        <w:pStyle w:val="a0"/>
-      </w:pPr>
-      <w:r>
-        <w:t>不要讓志工端看到整班學生資料。</w:t>
-      </w:r>
-    </w:p>
-    <w:p>
-      <w:pPr>
-        <w:pStyle w:val="a0"/>
-      </w:pPr>
-      <w:r>
-        <w:t>不要把真學生資料放進測試</w:t>
-      </w:r>
-      <w:r>
-        <w:t xml:space="preserve"> seed </w:t>
-      </w:r>
-      <w:r>
-        <w:t>檔或公開</w:t>
-      </w:r>
-      <w:r>
-        <w:t xml:space="preserve"> GitHub</w:t>
-      </w:r>
-      <w:r>
-        <w:t>。</w:t>
-      </w:r>
-    </w:p>
-    <w:p>
-      <w:pPr>
-        <w:pStyle w:val="a0"/>
-      </w:pPr>
-      <w:r>
-        <w:t>不要在</w:t>
-      </w:r>
-      <w:r>
-        <w:t xml:space="preserve"> Apple Developer </w:t>
-      </w:r>
-      <w:r>
-        <w:t>還</w:t>
-      </w:r>
-      <w:r>
-        <w:t xml:space="preserve"> pending </w:t>
-      </w:r>
-      <w:r>
-        <w:t>時急著做</w:t>
-      </w:r>
-      <w:r>
-        <w:t xml:space="preserve"> TestFlight </w:t>
-      </w:r>
-      <w:r>
-        <w:t>送審。</w:t>
-      </w:r>
-    </w:p>
-    <w:p>
-      <w:pPr>
-        <w:pStyle w:val="1"/>
-      </w:pPr>
-      <w:r>
-        <w:lastRenderedPageBreak/>
-        <w:t xml:space="preserve">13. </w:t>
+        <w:t xml:space="preserve">10. </w:t>
       </w:r>
       <w:r>
         <w:t>完成標準</w:t>
@@ -6047,6 +5240,7 @@
               <w:rPr>
                 <w:sz w:val="19"/>
               </w:rPr>
+              <w:lastRenderedPageBreak/>
               <w:t>Firebase</w:t>
             </w:r>
           </w:p>
@@ -6157,317 +5351,8 @@
       </w:tr>
     </w:tbl>
     <w:p/>
-    <w:p>
-      <w:pPr>
-        <w:pStyle w:val="1"/>
-      </w:pPr>
-      <w:r>
-        <w:t xml:space="preserve">14. </w:t>
-      </w:r>
-      <w:r>
-        <w:t>如果只能先傳一段話給隊友</w:t>
-      </w:r>
-    </w:p>
-    <w:tbl>
-      <w:tblPr>
-        <w:tblStyle w:val="aff2"/>
-        <w:tblW w:w="0" w:type="auto"/>
-        <w:jc w:val="center"/>
-        <w:tblLook w:val="04A0" w:firstRow="1" w:lastRow="0" w:firstColumn="1" w:lastColumn="0" w:noHBand="0" w:noVBand="1"/>
-      </w:tblPr>
-      <w:tblGrid>
-        <w:gridCol w:w="10080"/>
-      </w:tblGrid>
-      <w:tr>
-        <w:trPr>
-          <w:jc w:val="center"/>
-        </w:trPr>
-        <w:tc>
-          <w:tcPr>
-            <w:tcW w:w="10080" w:type="dxa"/>
-            <w:shd w:val="clear" w:color="auto" w:fill="E8F6F3"/>
-          </w:tcPr>
-          <w:p>
-            <w:pPr>
-              <w:spacing w:after="80"/>
-            </w:pPr>
-            <w:r>
-              <w:rPr>
-                <w:b/>
-                <w:color w:val="173C5A"/>
-                <w:sz w:val="22"/>
-              </w:rPr>
-              <w:t>可直接複製給隊友</w:t>
-            </w:r>
-          </w:p>
-          <w:p>
-            <w:pPr>
-              <w:spacing w:after="0"/>
-            </w:pPr>
-            <w:r>
-              <w:rPr>
-                <w:sz w:val="20"/>
-              </w:rPr>
-              <w:t>我們的</w:t>
-            </w:r>
-            <w:r>
-              <w:rPr>
-                <w:sz w:val="20"/>
-              </w:rPr>
-              <w:t xml:space="preserve"> Apple Developer </w:t>
-            </w:r>
-            <w:r>
-              <w:rPr>
-                <w:sz w:val="20"/>
-              </w:rPr>
-              <w:t>還在審核，所以現在先不用管</w:t>
-            </w:r>
-            <w:r>
-              <w:rPr>
-                <w:sz w:val="20"/>
-              </w:rPr>
-              <w:t xml:space="preserve"> TestFlight</w:t>
-            </w:r>
-            <w:r>
-              <w:rPr>
-                <w:sz w:val="20"/>
-              </w:rPr>
-              <w:t>。請你先用</w:t>
-            </w:r>
-            <w:r>
-              <w:rPr>
-                <w:sz w:val="20"/>
-              </w:rPr>
-              <w:t xml:space="preserve"> Mac </w:t>
-            </w:r>
-            <w:r>
-              <w:rPr>
-                <w:sz w:val="20"/>
-              </w:rPr>
-              <w:t>安裝</w:t>
-            </w:r>
-            <w:r>
-              <w:rPr>
-                <w:sz w:val="20"/>
-              </w:rPr>
-              <w:t xml:space="preserve"> Xcode </w:t>
-            </w:r>
-            <w:r>
-              <w:rPr>
-                <w:sz w:val="20"/>
-              </w:rPr>
-              <w:t>和</w:t>
-            </w:r>
-            <w:r>
-              <w:rPr>
-                <w:sz w:val="20"/>
-              </w:rPr>
-              <w:t xml:space="preserve"> GitHub Desktop</w:t>
-            </w:r>
-            <w:r>
-              <w:rPr>
-                <w:sz w:val="20"/>
-              </w:rPr>
-              <w:t>，</w:t>
-            </w:r>
-            <w:r>
-              <w:rPr>
-                <w:sz w:val="20"/>
-              </w:rPr>
-              <w:t>clone https://github.com/RayChen0503/English-PLUS.git</w:t>
-            </w:r>
-            <w:r>
-              <w:rPr>
-                <w:sz w:val="20"/>
-              </w:rPr>
-              <w:t>，先看</w:t>
-            </w:r>
-            <w:r>
-              <w:rPr>
-                <w:sz w:val="20"/>
-              </w:rPr>
-              <w:t xml:space="preserve"> docs/ios-testflight/round-8-xcode-development-handoff.md</w:t>
-            </w:r>
-            <w:r>
-              <w:rPr>
-                <w:sz w:val="20"/>
-              </w:rPr>
-              <w:t>，然後在</w:t>
-            </w:r>
-            <w:r>
-              <w:rPr>
-                <w:sz w:val="20"/>
-              </w:rPr>
-              <w:t xml:space="preserve"> ios/EnglishPlus </w:t>
-            </w:r>
-            <w:r>
-              <w:rPr>
-                <w:sz w:val="20"/>
-              </w:rPr>
-              <w:t>建</w:t>
-            </w:r>
-            <w:r>
-              <w:rPr>
-                <w:sz w:val="20"/>
-              </w:rPr>
-              <w:t xml:space="preserve"> SwiftUI </w:t>
-            </w:r>
-            <w:r>
-              <w:rPr>
-                <w:sz w:val="20"/>
-              </w:rPr>
-              <w:t>專案。</w:t>
-            </w:r>
-            <w:r>
-              <w:rPr>
-                <w:sz w:val="20"/>
-              </w:rPr>
-              <w:t xml:space="preserve">Project name </w:t>
-            </w:r>
-            <w:r>
-              <w:rPr>
-                <w:sz w:val="20"/>
-              </w:rPr>
-              <w:t>用</w:t>
-            </w:r>
-            <w:r>
-              <w:rPr>
-                <w:sz w:val="20"/>
-              </w:rPr>
-              <w:t xml:space="preserve"> EnglishPlus</w:t>
-            </w:r>
-            <w:r>
-              <w:rPr>
-                <w:sz w:val="20"/>
-              </w:rPr>
-              <w:t>，</w:t>
-            </w:r>
-            <w:r>
-              <w:rPr>
-                <w:sz w:val="20"/>
-              </w:rPr>
-              <w:t xml:space="preserve">App </w:t>
-            </w:r>
-            <w:r>
-              <w:rPr>
-                <w:sz w:val="20"/>
-              </w:rPr>
-              <w:t>顯示</w:t>
-            </w:r>
-            <w:r>
-              <w:rPr>
-                <w:sz w:val="20"/>
-              </w:rPr>
-              <w:t xml:space="preserve"> English+</w:t>
-            </w:r>
-            <w:r>
-              <w:rPr>
-                <w:sz w:val="20"/>
-              </w:rPr>
-              <w:t>，</w:t>
-            </w:r>
-            <w:r>
-              <w:rPr>
-                <w:sz w:val="20"/>
-              </w:rPr>
-              <w:t xml:space="preserve">Bundle ID </w:t>
-            </w:r>
-            <w:r>
-              <w:rPr>
-                <w:sz w:val="20"/>
-              </w:rPr>
-              <w:t>一定是</w:t>
-            </w:r>
-            <w:r>
-              <w:rPr>
-                <w:sz w:val="20"/>
-              </w:rPr>
-              <w:t xml:space="preserve"> tw.edu.englishplus</w:t>
-            </w:r>
-            <w:r>
-              <w:rPr>
-                <w:sz w:val="20"/>
-              </w:rPr>
-              <w:t>。第一版先用本機資料跑學生、老師、志工主流程，完成一段就</w:t>
-            </w:r>
-            <w:r>
-              <w:rPr>
-                <w:sz w:val="20"/>
-              </w:rPr>
-              <w:t xml:space="preserve"> commit/push main</w:t>
-            </w:r>
-            <w:r>
-              <w:rPr>
-                <w:sz w:val="20"/>
-              </w:rPr>
-              <w:t>。</w:t>
-            </w:r>
-          </w:p>
-        </w:tc>
-      </w:tr>
-    </w:tbl>
-    <w:p/>
-    <w:p>
-      <w:pPr>
-        <w:pStyle w:val="1"/>
-      </w:pPr>
-      <w:r>
-        <w:t xml:space="preserve">15. </w:t>
-      </w:r>
-      <w:r>
-        <w:t>官方來源</w:t>
-      </w:r>
-    </w:p>
-    <w:p>
-      <w:pPr>
-        <w:pStyle w:val="a0"/>
-      </w:pPr>
-      <w:r>
-        <w:t>Apple Xcode: https://developer.apple.com/xcode/</w:t>
-      </w:r>
-    </w:p>
-    <w:p>
-      <w:pPr>
-        <w:pStyle w:val="a0"/>
-      </w:pPr>
-      <w:r>
-        <w:t>Apple TestFlight: https://developer.apple.com/testflight/</w:t>
-      </w:r>
-    </w:p>
-    <w:p>
-      <w:pPr>
-        <w:pStyle w:val="a0"/>
-      </w:pPr>
-      <w:r>
-        <w:t>Apple Developer roles and access: https://developer.apple.com/help/account/access/roles/</w:t>
-      </w:r>
-    </w:p>
-    <w:p>
-      <w:pPr>
-        <w:pStyle w:val="a0"/>
-      </w:pPr>
-      <w:r>
-        <w:t>Firebase iOS setup: https://firebase.google.com/docs/ios/setup</w:t>
-      </w:r>
-    </w:p>
-    <w:p>
-      <w:pPr>
-        <w:pStyle w:val="a0"/>
-      </w:pPr>
-      <w:r>
-        <w:t>Firebase CLI: https://firebase.google.com/docs/cli</w:t>
-      </w:r>
-    </w:p>
-    <w:p>
-      <w:pPr>
-        <w:pStyle w:val="a0"/>
-      </w:pPr>
-      <w:r>
-        <w:t>GitHub Desktop clone workflow: https://docs.github.com/en/desktop/adding-and-cloning-repositories/cloning-and-forking-repositories-from-github-desktop</w:t>
-      </w:r>
-    </w:p>
     <w:sectPr>
-      <w:footerReference w:type="default" r:id="rId11"/>
+      <w:footerReference w:type="default" r:id="rId10"/>
       <w:pgSz w:w="12240" w:h="15840"/>
       <w:pgMar w:top="1008" w:right="1080" w:bottom="1008" w:left="1080" w:header="720" w:footer="720" w:gutter="0"/>
       <w:cols w:space="720"/>
@@ -6732,31 +5617,31 @@
       </w:rPr>
     </w:lvl>
   </w:abstractNum>
-  <w:num w:numId="1" w16cid:durableId="2015767464">
+  <w:num w:numId="1" w16cid:durableId="998922056">
     <w:abstractNumId w:val="8"/>
   </w:num>
-  <w:num w:numId="2" w16cid:durableId="1044988119">
+  <w:num w:numId="2" w16cid:durableId="1778716566">
     <w:abstractNumId w:val="6"/>
   </w:num>
-  <w:num w:numId="3" w16cid:durableId="275797545">
+  <w:num w:numId="3" w16cid:durableId="332611731">
     <w:abstractNumId w:val="5"/>
   </w:num>
-  <w:num w:numId="4" w16cid:durableId="832262868">
+  <w:num w:numId="4" w16cid:durableId="2100329505">
     <w:abstractNumId w:val="4"/>
   </w:num>
-  <w:num w:numId="5" w16cid:durableId="1653754717">
+  <w:num w:numId="5" w16cid:durableId="1453666209">
     <w:abstractNumId w:val="7"/>
   </w:num>
-  <w:num w:numId="6" w16cid:durableId="313267315">
+  <w:num w:numId="6" w16cid:durableId="1139028901">
     <w:abstractNumId w:val="3"/>
   </w:num>
-  <w:num w:numId="7" w16cid:durableId="1514340355">
+  <w:num w:numId="7" w16cid:durableId="976912284">
     <w:abstractNumId w:val="2"/>
   </w:num>
-  <w:num w:numId="8" w16cid:durableId="423721701">
+  <w:num w:numId="8" w16cid:durableId="1720209227">
     <w:abstractNumId w:val="1"/>
   </w:num>
-  <w:num w:numId="9" w16cid:durableId="1307130727">
+  <w:num w:numId="9" w16cid:durableId="519514340">
     <w:abstractNumId w:val="0"/>
   </w:num>
 </w:numbering>

</xml_diff>